<commit_message>
Rebuild the three Word exports
All three were behind their markdown after the terminology pass and the
section 6 retitle. make_docx.sh rebuilt each from the .md beside it, so the
stamps and the recorded commit now match: user guide 20260827_001, math
methods 20260827_003, presentation guide 20260827_002.

Content is pandoc's, unchanged from the markdown. No .md was touched.

Assisted-by: Claude Opus 5
</commit_message>
<xml_diff>
--- a/mlos_math_methods.docx
+++ b/mlos_math_methods.docx
@@ -20,7 +20,7 @@
           <w:i/>
           <w:iCs/>
         </w:rPr>
-        <w:t xml:space="preserve">Note: This Markdown file is the documentation of record for mLOS math methods, version 20260823_001. Read it in any markdown reader that renders LaTeX math, Obsidian among them. The companion</w:t>
+        <w:t xml:space="preserve">Note: This Markdown file is the documentation of record for mLOS math methods, version 20260827_003. Read it in any markdown reader that renders LaTeX math, Obsidian among them. The companion</w:t>
       </w:r>
       <w:r>
         <w:rPr>
@@ -90,7 +90,7 @@
           <w:i/>
           <w:iCs/>
         </w:rPr>
-        <w:t xml:space="preserve">at commit 9cd7d0b (2026-08-23). Where that is not the newest commit touching the file, this Word copy is behind it.</w:t>
+        <w:t xml:space="preserve">at commit 61faf56 (2026-08-27). Where that is not the newest commit touching the file, this Word copy is behind it.</w:t>
       </w:r>
     </w:p>
     <w:p>
@@ -17599,13 +17599,89 @@
     </w:p>
     <w:bookmarkEnd w:id="35"/>
     <w:bookmarkEnd w:id="36"/>
-    <w:bookmarkStart w:id="46" w:name="cox-proportional-hazards-regression"/>
+    <w:bookmarkStart w:id="46" w:name="regressions-on-the-three-factors"/>
     <w:p>
       <w:pPr>
         <w:pStyle w:val="Heading1"/>
       </w:pPr>
       <w:r>
-        <w:t xml:space="preserve">6. Cox Proportional-Hazards Regression</w:t>
+        <w:t xml:space="preserve">6. Regressions on the Three Factors</w:t>
+      </w:r>
+    </w:p>
+    <w:p>
+      <w:pPr>
+        <w:pStyle w:val="FirstParagraph"/>
+      </w:pPr>
+      <w:r>
+        <w:t xml:space="preserve">Two regression families are fitted on the same counting-process rows and the</w:t>
+      </w:r>
+      <w:r>
+        <w:t xml:space="preserve"> </w:t>
+      </w:r>
+      <w:r>
+        <w:t xml:space="preserve">same three factors: Cox, which leaves the baseline hazard unspecified, and an</w:t>
+      </w:r>
+      <w:r>
+        <w:t xml:space="preserve"> </w:t>
+      </w:r>
+      <w:r>
+        <w:t xml:space="preserve">optional Weibull, which gives it a parametric form and so reports a</w:t>
+      </w:r>
+      <w:r>
+        <w:t xml:space="preserve"> </w:t>
+      </w:r>
+      <w:r>
+        <w:t xml:space="preserve">length-of-stay ratio directly. In their pooled form both hand every covariate</w:t>
+      </w:r>
+      <w:r>
+        <w:t xml:space="preserve"> </w:t>
+      </w:r>
+      <w:r>
+        <w:t xml:space="preserve">pattern a single baseline shape.</w:t>
+      </w:r>
+    </w:p>
+    <w:p>
+      <w:pPr>
+        <w:pStyle w:val="BodyText"/>
+      </w:pPr>
+      <w:r>
+        <w:t xml:space="preserve">The order below is Cox first (§6.1 to §6.5), then the Weibull and its shape</w:t>
+      </w:r>
+      <w:r>
+        <w:t xml:space="preserve"> </w:t>
+      </w:r>
+      <w:r>
+        <w:t xml:space="preserve">variants (§6.6 and §6.7), then the stratified Cox (§6.8). The last two allow the</w:t>
+      </w:r>
+      <w:r>
+        <w:t xml:space="preserve"> </w:t>
+      </w:r>
+      <w:r>
+        <w:t xml:space="preserve">covariate pattern to affect the shape of the LOS distribution or the hazard</w:t>
+      </w:r>
+      <w:r>
+        <w:t xml:space="preserve"> </w:t>
+      </w:r>
+      <w:r>
+        <w:t xml:space="preserve">function. §6.7 relaxes the LOS distribution parametrically, by freeing the</w:t>
+      </w:r>
+      <w:r>
+        <w:t xml:space="preserve"> </w:t>
+      </w:r>
+      <w:r>
+        <w:t xml:space="preserve">Weibull shape. §6.8 relaxes the hazard function nonparametrically, by giving</w:t>
+      </w:r>
+      <w:r>
+        <w:t xml:space="preserve"> </w:t>
+      </w:r>
+      <w:r>
+        <w:t xml:space="preserve">each combination of the other factors its own baseline. §6.8 closes by comparing</w:t>
+      </w:r>
+      <w:r>
+        <w:t xml:space="preserve"> </w:t>
+      </w:r>
+      <w:r>
+        <w:t xml:space="preserve">what the two approaches to relaxation say on the same data.</w:t>
       </w:r>
     </w:p>
     <w:bookmarkStart w:id="37" w:name="model-and-predictors"/>
@@ -19297,7 +19373,7 @@
         <w:t xml:space="preserve"> </w:t>
       </w:r>
       <w:r>
-        <w:t xml:space="preserve">This time-scale reading is available precisely because the Cox model pools all outcome types (§6.1). The outcome-specific curves of §7 have shapes that are harder to characterize and certainly differ by outcome type, driven by mechanistic constraints early in the stay, such as a hold period during which return-to-owner outcomes concentrate while adoption of stray intakes cannot yet occur. Those distortions largely offset in the pooled curve, which is why the all-cause curve is the smoother, better-behaved object. Fitting Cox models per outcome type (censoring competing outcomes) would compound this with the deeper problem that such fits address a hypothetical world where the competing outcomes do not occur. Regression on the outcome-specific cumulative incidences themselves (Fine–Gray/Gray) is not currently included in mLOS but may be added in a future version.</w:t>
+        <w:t xml:space="preserve">This time-scale reading is available precisely because the Cox model pools all outcome types (§6.1). The outcome-specific curves of §7 have shapes that are harder to characterize and certainly differ by outcome type, driven by mechanistic constraints early in the stay, such as a hold period during which return-to-owner outcomes concentrate while adoption of stray intakes cannot yet occur. Those distortions largely offset in the all-cause curve, which is why it is the smoother, better-behaved object. Fitting Cox models per outcome type (censoring competing outcomes) would compound this with the deeper problem that such fits address a hypothetical world where the competing outcomes do not occur. Regression on the outcome-specific cumulative incidences themselves (Fine–Gray/Gray) is not currently included in mLOS but may be added in a future version.</w:t>
       </w:r>
     </w:p>
     <w:bookmarkEnd w:id="41"/>
@@ -20425,13 +20501,13 @@
           <w:i/>
           <w:iCs/>
         </w:rPr>
-        <w:t xml:space="preserve">pooled</w:t>
-      </w:r>
-      <w:r>
-        <w:t xml:space="preserve"> </w:t>
-      </w:r>
-      <w:r>
-        <w:t xml:space="preserve">discharge process, and the pair of shapes is a diagnostic for unobserved-mixture effects: with heterogeneous groups, the pooled hazard falls with tenure as the fast-leaving group drains out of the risk set, even when every group’s own hazard is constant. A pooled</w:t>
+        <w:t xml:space="preserve">marginal</w:t>
+      </w:r>
+      <w:r>
+        <w:t xml:space="preserve"> </w:t>
+      </w:r>
+      <w:r>
+        <w:t xml:space="preserve">discharge process, and the pair of shapes is a diagnostic for unobserved-mixture effects: with heterogeneous groups, the marginal hazard falls with tenure as the fast-leaving group drains out of the risk set, even when every group’s own hazard is constant. A crude</w:t>
       </w:r>
       <w:r>
         <w:t xml:space="preserve"> </w:t>
@@ -20650,7 +20726,7 @@
         <w:t xml:space="preserve"> </w:t>
       </w:r>
       <w:r>
-        <w:t xml:space="preserve">of intake types and animal groups across periods — a composition effect of exactly the kind the crude-companion comparison of §6.6 exposes for the pooled curve. Cox (§6.1) and the general Weibull of §6.6 both adjust for this, holding intake type and animal group fixed as covariates alongside period, so their period coefficient describes period’s own effect. But both still force</w:t>
+        <w:t xml:space="preserve">of intake types and animal groups across periods — a composition effect of exactly the kind the crude-companion comparison of §6.6 exposes for the marginal curve. Cox (§6.1) and the pooled Weibull of §6.6 both adjust for this, holding intake type and animal group fixed as covariates alongside period, so their period coefficient describes period’s own effect. But both still force</w:t>
       </w:r>
       <w:r>
         <w:t xml:space="preserve"> </w:t>
@@ -20676,7 +20752,7 @@
         <w:t xml:space="preserve">shared</w:t>
       </w:r>
       <w:r>
-        <w:t xml:space="preserve">, so proportional hazards ties every intake type and animal group to the same baseline shape. The general Weibull’s baseline is parametric but likewise a single</w:t>
+        <w:t xml:space="preserve">, so proportional hazards ties every intake type and animal group to the same baseline shape. The pooled Weibull’s baseline is parametric but likewise a single</w:t>
       </w:r>
       <w:r>
         <w:t xml:space="preserve"> </w:t>
@@ -20788,7 +20864,7 @@
         </m:r>
       </m:oMath>
       <w:r>
-        <w:t xml:space="preserve">’s LOS ratio is read under the same adjustment as the general Weibull and is directly comparable to it cell for cell. What changes is that the</w:t>
+        <w:t xml:space="preserve">’s LOS ratio is read under the same adjustment as the pooled Weibull and is directly comparable to it cell for cell. What changes is that the</w:t>
       </w:r>
       <w:r>
         <w:t xml:space="preserve"> </w:t>
@@ -21327,7 +21403,7 @@
         <w:t xml:space="preserve"> </w:t>
       </w:r>
       <w:r>
-        <w:t xml:space="preserve">A shape ratio near 1 (CI spanning it) says that predictor’s levels share one discharge-hazard shape, so the single-shape assumption behind the general Weibull (and, via §6.5, the Cox proportional-hazards assumption) is not contradicted for that predictor here. A shape ratio far from 1 says the levels’ hazards evolve differently over the stay, a distinction the pooled models cannot see and do not report, since they fit one</w:t>
+        <w:t xml:space="preserve">A shape ratio near 1 (CI spanning it) says that predictor’s levels share one discharge-hazard shape, so the single-shape assumption behind the pooled Weibull (and, via §6.5, the Cox proportional-hazards assumption) is not contradicted for that predictor here. A shape ratio far from 1 says the levels’ hazards evolve differently over the stay, a distinction the pooled models cannot see and do not report, since they fit one</w:t>
       </w:r>
       <w:r>
         <w:t xml:space="preserve"> </w:t>

</xml_diff>